<commit_message>
feat: se genera dataset simulado con errores incluidos para posterior limpieza y normalización. HU01 Completada
</commit_message>
<xml_diff>
--- a/modelo_bd_sorprendeme.docx
+++ b/modelo_bd_sorprendeme.docx
@@ -38,6 +38,9 @@
         </w:rPr>
       </w:pPr>
       <w:r>
+        <w:rPr>
+          <w:noProof/>
+        </w:rPr>
         <w:drawing>
           <wp:anchor distT="0" distB="0" distL="114300" distR="114300" simplePos="0" relativeHeight="251659264" behindDoc="0" locked="0" layoutInCell="1" allowOverlap="1" wp14:anchorId="5494FCEA" wp14:editId="72B7889A">
             <wp:simplePos x="0" y="0"/>
@@ -129,17 +132,7 @@
           <w:sz w:val="19"/>
           <w:szCs w:val="19"/>
         </w:rPr>
-        <w:t>Catálogo</w:t>
-      </w:r>
-      <w:r>
-        <w:rPr>
-          <w:i/>
-          <w:iCs/>
-          <w:color w:val="888888"/>
-          <w:sz w:val="19"/>
-          <w:szCs w:val="19"/>
-        </w:rPr>
-        <w:t xml:space="preserve"> de productos disponibles en la tienda</w:t>
+        <w:t>Catálogo de productos disponibles en la tienda</w:t>
       </w:r>
     </w:p>
     <w:tbl>
@@ -166,12 +159,6 @@
         <w:gridCol w:w="3760"/>
       </w:tblGrid>
       <w:tr>
-        <w:tblPrEx>
-          <w:tblCellMar>
-            <w:top w:w="0" w:type="dxa"/>
-            <w:bottom w:w="0" w:type="dxa"/>
-          </w:tblCellMar>
-        </w:tblPrEx>
         <w:trPr>
           <w:tblHeader/>
         </w:trPr>
@@ -313,12 +300,6 @@
         </w:tc>
       </w:tr>
       <w:tr>
-        <w:tblPrEx>
-          <w:tblCellMar>
-            <w:top w:w="0" w:type="dxa"/>
-            <w:bottom w:w="0" w:type="dxa"/>
-          </w:tblCellMar>
-        </w:tblPrEx>
         <w:tc>
           <w:tcPr>
             <w:tcW w:w="1600" w:type="dxa"/>
@@ -447,12 +428,6 @@
         </w:tc>
       </w:tr>
       <w:tr>
-        <w:tblPrEx>
-          <w:tblCellMar>
-            <w:top w:w="0" w:type="dxa"/>
-            <w:bottom w:w="0" w:type="dxa"/>
-          </w:tblCellMar>
-        </w:tblPrEx>
         <w:tc>
           <w:tcPr>
             <w:tcW w:w="1600" w:type="dxa"/>
@@ -497,13 +472,23 @@
             </w:tcMar>
           </w:tcPr>
           <w:p>
-            <w:r>
-              <w:rPr>
-                <w:color w:val="3D2C2C"/>
-                <w:sz w:val="19"/>
-                <w:szCs w:val="19"/>
-              </w:rPr>
-              <w:t>VARCHAR(100)</w:t>
+            <w:proofErr w:type="gramStart"/>
+            <w:r>
+              <w:rPr>
+                <w:color w:val="3D2C2C"/>
+                <w:sz w:val="19"/>
+                <w:szCs w:val="19"/>
+              </w:rPr>
+              <w:t>VARCHAR(</w:t>
+            </w:r>
+            <w:proofErr w:type="gramEnd"/>
+            <w:r>
+              <w:rPr>
+                <w:color w:val="3D2C2C"/>
+                <w:sz w:val="19"/>
+                <w:szCs w:val="19"/>
+              </w:rPr>
+              <w:t>100)</w:t>
             </w:r>
           </w:p>
         </w:tc>
@@ -563,12 +548,6 @@
         </w:tc>
       </w:tr>
       <w:tr>
-        <w:tblPrEx>
-          <w:tblCellMar>
-            <w:top w:w="0" w:type="dxa"/>
-            <w:bottom w:w="0" w:type="dxa"/>
-          </w:tblCellMar>
-        </w:tblPrEx>
         <w:tc>
           <w:tcPr>
             <w:tcW w:w="1600" w:type="dxa"/>
@@ -675,26 +654,12 @@
                 <w:sz w:val="19"/>
                 <w:szCs w:val="19"/>
               </w:rPr>
-              <w:t>Descripción</w:t>
-            </w:r>
-            <w:r>
-              <w:rPr>
-                <w:color w:val="3D2C2C"/>
-                <w:sz w:val="19"/>
-                <w:szCs w:val="19"/>
-              </w:rPr>
-              <w:t xml:space="preserve"> detallada</w:t>
+              <w:t>Descripción detallada</w:t>
             </w:r>
           </w:p>
         </w:tc>
       </w:tr>
       <w:tr>
-        <w:tblPrEx>
-          <w:tblCellMar>
-            <w:top w:w="0" w:type="dxa"/>
-            <w:bottom w:w="0" w:type="dxa"/>
-          </w:tblCellMar>
-        </w:tblPrEx>
         <w:tc>
           <w:tcPr>
             <w:tcW w:w="1600" w:type="dxa"/>
@@ -739,13 +704,23 @@
             </w:tcMar>
           </w:tcPr>
           <w:p>
-            <w:r>
-              <w:rPr>
-                <w:color w:val="3D2C2C"/>
-                <w:sz w:val="19"/>
-                <w:szCs w:val="19"/>
-              </w:rPr>
-              <w:t>DECIMAL(10,2)</w:t>
+            <w:proofErr w:type="gramStart"/>
+            <w:r>
+              <w:rPr>
+                <w:color w:val="3D2C2C"/>
+                <w:sz w:val="19"/>
+                <w:szCs w:val="19"/>
+              </w:rPr>
+              <w:t>DECIMAL(</w:t>
+            </w:r>
+            <w:proofErr w:type="gramEnd"/>
+            <w:r>
+              <w:rPr>
+                <w:color w:val="3D2C2C"/>
+                <w:sz w:val="19"/>
+                <w:szCs w:val="19"/>
+              </w:rPr>
+              <w:t>10,2)</w:t>
             </w:r>
           </w:p>
         </w:tc>
@@ -805,12 +780,6 @@
         </w:tc>
       </w:tr>
       <w:tr>
-        <w:tblPrEx>
-          <w:tblCellMar>
-            <w:top w:w="0" w:type="dxa"/>
-            <w:bottom w:w="0" w:type="dxa"/>
-          </w:tblCellMar>
-        </w:tblPrEx>
         <w:tc>
           <w:tcPr>
             <w:tcW w:w="1600" w:type="dxa"/>
@@ -857,13 +826,23 @@
             </w:tcMar>
           </w:tcPr>
           <w:p>
-            <w:r>
-              <w:rPr>
-                <w:color w:val="3D2C2C"/>
-                <w:sz w:val="19"/>
-                <w:szCs w:val="19"/>
-              </w:rPr>
-              <w:t>VARCHAR(20)</w:t>
+            <w:proofErr w:type="gramStart"/>
+            <w:r>
+              <w:rPr>
+                <w:color w:val="3D2C2C"/>
+                <w:sz w:val="19"/>
+                <w:szCs w:val="19"/>
+              </w:rPr>
+              <w:t>VARCHAR(</w:t>
+            </w:r>
+            <w:proofErr w:type="gramEnd"/>
+            <w:r>
+              <w:rPr>
+                <w:color w:val="3D2C2C"/>
+                <w:sz w:val="19"/>
+                <w:szCs w:val="19"/>
+              </w:rPr>
+              <w:t>20)</w:t>
             </w:r>
           </w:p>
         </w:tc>
@@ -923,12 +902,6 @@
         </w:tc>
       </w:tr>
       <w:tr>
-        <w:tblPrEx>
-          <w:tblCellMar>
-            <w:top w:w="0" w:type="dxa"/>
-            <w:bottom w:w="0" w:type="dxa"/>
-          </w:tblCellMar>
-        </w:tblPrEx>
         <w:tc>
           <w:tcPr>
             <w:tcW w:w="1600" w:type="dxa"/>
@@ -975,13 +948,23 @@
             </w:tcMar>
           </w:tcPr>
           <w:p>
-            <w:r>
-              <w:rPr>
-                <w:color w:val="3D2C2C"/>
-                <w:sz w:val="19"/>
-                <w:szCs w:val="19"/>
-              </w:rPr>
-              <w:t>VARCHAR(255)</w:t>
+            <w:proofErr w:type="gramStart"/>
+            <w:r>
+              <w:rPr>
+                <w:color w:val="3D2C2C"/>
+                <w:sz w:val="19"/>
+                <w:szCs w:val="19"/>
+              </w:rPr>
+              <w:t>VARCHAR(</w:t>
+            </w:r>
+            <w:proofErr w:type="gramEnd"/>
+            <w:r>
+              <w:rPr>
+                <w:color w:val="3D2C2C"/>
+                <w:sz w:val="19"/>
+                <w:szCs w:val="19"/>
+              </w:rPr>
+              <w:t>255)</w:t>
             </w:r>
           </w:p>
         </w:tc>
@@ -1041,12 +1024,6 @@
         </w:tc>
       </w:tr>
       <w:tr>
-        <w:tblPrEx>
-          <w:tblCellMar>
-            <w:top w:w="0" w:type="dxa"/>
-            <w:bottom w:w="0" w:type="dxa"/>
-          </w:tblCellMar>
-        </w:tblPrEx>
         <w:tc>
           <w:tcPr>
             <w:tcW w:w="1600" w:type="dxa"/>
@@ -1216,12 +1193,6 @@
         <w:gridCol w:w="3721"/>
       </w:tblGrid>
       <w:tr>
-        <w:tblPrEx>
-          <w:tblCellMar>
-            <w:top w:w="0" w:type="dxa"/>
-            <w:bottom w:w="0" w:type="dxa"/>
-          </w:tblCellMar>
-        </w:tblPrEx>
         <w:trPr>
           <w:tblHeader/>
         </w:trPr>
@@ -1367,12 +1338,6 @@
         </w:tc>
       </w:tr>
       <w:tr>
-        <w:tblPrEx>
-          <w:tblCellMar>
-            <w:top w:w="0" w:type="dxa"/>
-            <w:bottom w:w="0" w:type="dxa"/>
-          </w:tblCellMar>
-        </w:tblPrEx>
         <w:tc>
           <w:tcPr>
             <w:tcW w:w="1600" w:type="dxa"/>
@@ -1501,12 +1466,6 @@
         </w:tc>
       </w:tr>
       <w:tr>
-        <w:tblPrEx>
-          <w:tblCellMar>
-            <w:top w:w="0" w:type="dxa"/>
-            <w:bottom w:w="0" w:type="dxa"/>
-          </w:tblCellMar>
-        </w:tblPrEx>
         <w:tc>
           <w:tcPr>
             <w:tcW w:w="1600" w:type="dxa"/>
@@ -1553,13 +1512,23 @@
             </w:tcMar>
           </w:tcPr>
           <w:p>
-            <w:r>
-              <w:rPr>
-                <w:color w:val="3D2C2C"/>
-                <w:sz w:val="19"/>
-                <w:szCs w:val="19"/>
-              </w:rPr>
-              <w:t>VARCHAR(100)</w:t>
+            <w:proofErr w:type="gramStart"/>
+            <w:r>
+              <w:rPr>
+                <w:color w:val="3D2C2C"/>
+                <w:sz w:val="19"/>
+                <w:szCs w:val="19"/>
+              </w:rPr>
+              <w:t>VARCHAR(</w:t>
+            </w:r>
+            <w:proofErr w:type="gramEnd"/>
+            <w:r>
+              <w:rPr>
+                <w:color w:val="3D2C2C"/>
+                <w:sz w:val="19"/>
+                <w:szCs w:val="19"/>
+              </w:rPr>
+              <w:t>100)</w:t>
             </w:r>
           </w:p>
         </w:tc>
@@ -1619,12 +1588,6 @@
         </w:tc>
       </w:tr>
       <w:tr>
-        <w:tblPrEx>
-          <w:tblCellMar>
-            <w:top w:w="0" w:type="dxa"/>
-            <w:bottom w:w="0" w:type="dxa"/>
-          </w:tblCellMar>
-        </w:tblPrEx>
         <w:tc>
           <w:tcPr>
             <w:tcW w:w="1600" w:type="dxa"/>
@@ -1671,13 +1634,23 @@
             </w:tcMar>
           </w:tcPr>
           <w:p>
-            <w:r>
-              <w:rPr>
-                <w:color w:val="3D2C2C"/>
-                <w:sz w:val="19"/>
-                <w:szCs w:val="19"/>
-              </w:rPr>
-              <w:t>VARCHAR(20)</w:t>
+            <w:proofErr w:type="gramStart"/>
+            <w:r>
+              <w:rPr>
+                <w:color w:val="3D2C2C"/>
+                <w:sz w:val="19"/>
+                <w:szCs w:val="19"/>
+              </w:rPr>
+              <w:t>VARCHAR(</w:t>
+            </w:r>
+            <w:proofErr w:type="gramEnd"/>
+            <w:r>
+              <w:rPr>
+                <w:color w:val="3D2C2C"/>
+                <w:sz w:val="19"/>
+                <w:szCs w:val="19"/>
+              </w:rPr>
+              <w:t>20)</w:t>
             </w:r>
           </w:p>
         </w:tc>
@@ -1731,26 +1704,12 @@
                 <w:sz w:val="19"/>
                 <w:szCs w:val="19"/>
               </w:rPr>
-              <w:t>Teléfono</w:t>
-            </w:r>
-            <w:r>
-              <w:rPr>
-                <w:color w:val="3D2C2C"/>
-                <w:sz w:val="19"/>
-                <w:szCs w:val="19"/>
-              </w:rPr>
-              <w:t xml:space="preserve"> de contacto</w:t>
+              <w:t>Teléfono de contacto</w:t>
             </w:r>
           </w:p>
         </w:tc>
       </w:tr>
       <w:tr>
-        <w:tblPrEx>
-          <w:tblCellMar>
-            <w:top w:w="0" w:type="dxa"/>
-            <w:bottom w:w="0" w:type="dxa"/>
-          </w:tblCellMar>
-        </w:tblPrEx>
         <w:tc>
           <w:tcPr>
             <w:tcW w:w="1600" w:type="dxa"/>
@@ -1795,13 +1754,23 @@
             </w:tcMar>
           </w:tcPr>
           <w:p>
-            <w:r>
-              <w:rPr>
-                <w:color w:val="3D2C2C"/>
-                <w:sz w:val="19"/>
-                <w:szCs w:val="19"/>
-              </w:rPr>
-              <w:t>VARCHAR(100)</w:t>
+            <w:proofErr w:type="gramStart"/>
+            <w:r>
+              <w:rPr>
+                <w:color w:val="3D2C2C"/>
+                <w:sz w:val="19"/>
+                <w:szCs w:val="19"/>
+              </w:rPr>
+              <w:t>VARCHAR(</w:t>
+            </w:r>
+            <w:proofErr w:type="gramEnd"/>
+            <w:r>
+              <w:rPr>
+                <w:color w:val="3D2C2C"/>
+                <w:sz w:val="19"/>
+                <w:szCs w:val="19"/>
+              </w:rPr>
+              <w:t>100)</w:t>
             </w:r>
           </w:p>
         </w:tc>
@@ -1869,12 +1838,6 @@
         </w:tc>
       </w:tr>
       <w:tr>
-        <w:tblPrEx>
-          <w:tblCellMar>
-            <w:top w:w="0" w:type="dxa"/>
-            <w:bottom w:w="0" w:type="dxa"/>
-          </w:tblCellMar>
-        </w:tblPrEx>
         <w:tc>
           <w:tcPr>
             <w:tcW w:w="1600" w:type="dxa"/>
@@ -1921,13 +1884,23 @@
             </w:tcMar>
           </w:tcPr>
           <w:p>
-            <w:r>
-              <w:rPr>
-                <w:color w:val="3D2C2C"/>
-                <w:sz w:val="19"/>
-                <w:szCs w:val="19"/>
-              </w:rPr>
-              <w:t>VARCHAR(255)</w:t>
+            <w:proofErr w:type="gramStart"/>
+            <w:r>
+              <w:rPr>
+                <w:color w:val="3D2C2C"/>
+                <w:sz w:val="19"/>
+                <w:szCs w:val="19"/>
+              </w:rPr>
+              <w:t>VARCHAR(</w:t>
+            </w:r>
+            <w:proofErr w:type="gramEnd"/>
+            <w:r>
+              <w:rPr>
+                <w:color w:val="3D2C2C"/>
+                <w:sz w:val="19"/>
+                <w:szCs w:val="19"/>
+              </w:rPr>
+              <w:t>255)</w:t>
             </w:r>
           </w:p>
         </w:tc>
@@ -1981,26 +1954,12 @@
                 <w:sz w:val="19"/>
                 <w:szCs w:val="19"/>
               </w:rPr>
-              <w:t>Dirección</w:t>
-            </w:r>
-            <w:r>
-              <w:rPr>
-                <w:color w:val="3D2C2C"/>
-                <w:sz w:val="19"/>
-                <w:szCs w:val="19"/>
-              </w:rPr>
-              <w:t xml:space="preserve"> de entrega</w:t>
+              <w:t>Dirección de entrega</w:t>
             </w:r>
           </w:p>
         </w:tc>
       </w:tr>
       <w:tr>
-        <w:tblPrEx>
-          <w:tblCellMar>
-            <w:top w:w="0" w:type="dxa"/>
-            <w:bottom w:w="0" w:type="dxa"/>
-          </w:tblCellMar>
-        </w:tblPrEx>
         <w:tc>
           <w:tcPr>
             <w:tcW w:w="1600" w:type="dxa"/>
@@ -2111,12 +2070,6 @@
         </w:tc>
       </w:tr>
       <w:tr>
-        <w:tblPrEx>
-          <w:tblCellMar>
-            <w:top w:w="0" w:type="dxa"/>
-            <w:bottom w:w="0" w:type="dxa"/>
-          </w:tblCellMar>
-        </w:tblPrEx>
         <w:tc>
           <w:tcPr>
             <w:tcW w:w="1600" w:type="dxa"/>
@@ -2161,13 +2114,23 @@
             </w:tcMar>
           </w:tcPr>
           <w:p>
-            <w:r>
-              <w:rPr>
-                <w:color w:val="3D2C2C"/>
-                <w:sz w:val="19"/>
-                <w:szCs w:val="19"/>
-              </w:rPr>
-              <w:t>VARCHAR(20)</w:t>
+            <w:proofErr w:type="gramStart"/>
+            <w:r>
+              <w:rPr>
+                <w:color w:val="3D2C2C"/>
+                <w:sz w:val="19"/>
+                <w:szCs w:val="19"/>
+              </w:rPr>
+              <w:t>VARCHAR(</w:t>
+            </w:r>
+            <w:proofErr w:type="gramEnd"/>
+            <w:r>
+              <w:rPr>
+                <w:color w:val="3D2C2C"/>
+                <w:sz w:val="19"/>
+                <w:szCs w:val="19"/>
+              </w:rPr>
+              <w:t>20)</w:t>
             </w:r>
           </w:p>
         </w:tc>
@@ -2235,12 +2198,6 @@
         </w:tc>
       </w:tr>
       <w:tr>
-        <w:tblPrEx>
-          <w:tblCellMar>
-            <w:top w:w="0" w:type="dxa"/>
-            <w:bottom w:w="0" w:type="dxa"/>
-          </w:tblCellMar>
-        </w:tblPrEx>
         <w:tc>
           <w:tcPr>
             <w:tcW w:w="1600" w:type="dxa"/>
@@ -2287,13 +2244,23 @@
             </w:tcMar>
           </w:tcPr>
           <w:p>
-            <w:r>
-              <w:rPr>
-                <w:color w:val="3D2C2C"/>
-                <w:sz w:val="19"/>
-                <w:szCs w:val="19"/>
-              </w:rPr>
-              <w:t>VARCHAR(100)</w:t>
+            <w:proofErr w:type="gramStart"/>
+            <w:r>
+              <w:rPr>
+                <w:color w:val="3D2C2C"/>
+                <w:sz w:val="19"/>
+                <w:szCs w:val="19"/>
+              </w:rPr>
+              <w:t>VARCHAR(</w:t>
+            </w:r>
+            <w:proofErr w:type="gramEnd"/>
+            <w:r>
+              <w:rPr>
+                <w:color w:val="3D2C2C"/>
+                <w:sz w:val="19"/>
+                <w:szCs w:val="19"/>
+              </w:rPr>
+              <w:t>100)</w:t>
             </w:r>
           </w:p>
         </w:tc>
@@ -2363,12 +2330,6 @@
         </w:tc>
       </w:tr>
       <w:tr>
-        <w:tblPrEx>
-          <w:tblCellMar>
-            <w:top w:w="0" w:type="dxa"/>
-            <w:bottom w:w="0" w:type="dxa"/>
-          </w:tblCellMar>
-        </w:tblPrEx>
         <w:tc>
           <w:tcPr>
             <w:tcW w:w="1600" w:type="dxa"/>
@@ -2393,9 +2354,19 @@
                 <w:sz w:val="19"/>
                 <w:szCs w:val="19"/>
               </w:rPr>
-              <w:t>mp_status</w:t>
+              <w:t>mp_</w:t>
+            </w:r>
+            <w:proofErr w:type="gramStart"/>
+            <w:r>
+              <w:rPr>
+                <w:color w:val="3D2C2C"/>
+                <w:sz w:val="19"/>
+                <w:szCs w:val="19"/>
+              </w:rPr>
+              <w:t>status</w:t>
             </w:r>
             <w:proofErr w:type="spellEnd"/>
+            <w:proofErr w:type="gramEnd"/>
           </w:p>
         </w:tc>
         <w:tc>
@@ -2415,13 +2386,23 @@
             </w:tcMar>
           </w:tcPr>
           <w:p>
-            <w:r>
-              <w:rPr>
-                <w:color w:val="3D2C2C"/>
-                <w:sz w:val="19"/>
-                <w:szCs w:val="19"/>
-              </w:rPr>
-              <w:t>VARCHAR(20)</w:t>
+            <w:proofErr w:type="gramStart"/>
+            <w:r>
+              <w:rPr>
+                <w:color w:val="3D2C2C"/>
+                <w:sz w:val="19"/>
+                <w:szCs w:val="19"/>
+              </w:rPr>
+              <w:t>VARCHAR(</w:t>
+            </w:r>
+            <w:proofErr w:type="gramEnd"/>
+            <w:r>
+              <w:rPr>
+                <w:color w:val="3D2C2C"/>
+                <w:sz w:val="19"/>
+                <w:szCs w:val="19"/>
+              </w:rPr>
+              <w:t>20)</w:t>
             </w:r>
           </w:p>
         </w:tc>
@@ -2550,12 +2531,6 @@
         <w:gridCol w:w="3760"/>
       </w:tblGrid>
       <w:tr>
-        <w:tblPrEx>
-          <w:tblCellMar>
-            <w:top w:w="0" w:type="dxa"/>
-            <w:bottom w:w="0" w:type="dxa"/>
-          </w:tblCellMar>
-        </w:tblPrEx>
         <w:trPr>
           <w:tblHeader/>
         </w:trPr>
@@ -2701,12 +2676,6 @@
         </w:tc>
       </w:tr>
       <w:tr>
-        <w:tblPrEx>
-          <w:tblCellMar>
-            <w:top w:w="0" w:type="dxa"/>
-            <w:bottom w:w="0" w:type="dxa"/>
-          </w:tblCellMar>
-        </w:tblPrEx>
         <w:tc>
           <w:tcPr>
             <w:tcW w:w="1600" w:type="dxa"/>
@@ -2837,12 +2806,6 @@
         </w:tc>
       </w:tr>
       <w:tr>
-        <w:tblPrEx>
-          <w:tblCellMar>
-            <w:top w:w="0" w:type="dxa"/>
-            <w:bottom w:w="0" w:type="dxa"/>
-          </w:tblCellMar>
-        </w:tblPrEx>
         <w:tc>
           <w:tcPr>
             <w:tcW w:w="1600" w:type="dxa"/>
@@ -2969,12 +2932,6 @@
         </w:tc>
       </w:tr>
       <w:tr>
-        <w:tblPrEx>
-          <w:tblCellMar>
-            <w:top w:w="0" w:type="dxa"/>
-            <w:bottom w:w="0" w:type="dxa"/>
-          </w:tblCellMar>
-        </w:tblPrEx>
         <w:tc>
           <w:tcPr>
             <w:tcW w:w="1600" w:type="dxa"/>
@@ -3101,12 +3058,6 @@
         </w:tc>
       </w:tr>
       <w:tr>
-        <w:tblPrEx>
-          <w:tblCellMar>
-            <w:top w:w="0" w:type="dxa"/>
-            <w:bottom w:w="0" w:type="dxa"/>
-          </w:tblCellMar>
-        </w:tblPrEx>
         <w:tc>
           <w:tcPr>
             <w:tcW w:w="1600" w:type="dxa"/>
@@ -3218,12 +3169,6 @@
         </w:tc>
       </w:tr>
       <w:tr>
-        <w:tblPrEx>
-          <w:tblCellMar>
-            <w:top w:w="0" w:type="dxa"/>
-            <w:bottom w:w="0" w:type="dxa"/>
-          </w:tblCellMar>
-        </w:tblPrEx>
         <w:tc>
           <w:tcPr>
             <w:tcW w:w="1600" w:type="dxa"/>
@@ -3270,13 +3215,23 @@
             </w:tcMar>
           </w:tcPr>
           <w:p>
-            <w:r>
-              <w:rPr>
-                <w:color w:val="3D2C2C"/>
-                <w:sz w:val="19"/>
-                <w:szCs w:val="19"/>
-              </w:rPr>
-              <w:t>DECIMAL(10,2)</w:t>
+            <w:proofErr w:type="gramStart"/>
+            <w:r>
+              <w:rPr>
+                <w:color w:val="3D2C2C"/>
+                <w:sz w:val="19"/>
+                <w:szCs w:val="19"/>
+              </w:rPr>
+              <w:t>DECIMAL(</w:t>
+            </w:r>
+            <w:proofErr w:type="gramEnd"/>
+            <w:r>
+              <w:rPr>
+                <w:color w:val="3D2C2C"/>
+                <w:sz w:val="19"/>
+                <w:szCs w:val="19"/>
+              </w:rPr>
+              <w:t>10,2)</w:t>
             </w:r>
           </w:p>
         </w:tc>
@@ -3425,12 +3380,6 @@
         <w:gridCol w:w="3360"/>
       </w:tblGrid>
       <w:tr>
-        <w:tblPrEx>
-          <w:tblCellMar>
-            <w:top w:w="0" w:type="dxa"/>
-            <w:bottom w:w="0" w:type="dxa"/>
-          </w:tblCellMar>
-        </w:tblPrEx>
         <w:trPr>
           <w:tblHeader/>
         </w:trPr>
@@ -3572,12 +3521,6 @@
         </w:tc>
       </w:tr>
       <w:tr>
-        <w:tblPrEx>
-          <w:tblCellMar>
-            <w:top w:w="0" w:type="dxa"/>
-            <w:bottom w:w="0" w:type="dxa"/>
-          </w:tblCellMar>
-        </w:tblPrEx>
         <w:tc>
           <w:tcPr>
             <w:tcW w:w="2200" w:type="dxa"/>
@@ -3708,12 +3651,6 @@
         </w:tc>
       </w:tr>
       <w:tr>
-        <w:tblPrEx>
-          <w:tblCellMar>
-            <w:top w:w="0" w:type="dxa"/>
-            <w:bottom w:w="0" w:type="dxa"/>
-          </w:tblCellMar>
-        </w:tblPrEx>
         <w:tc>
           <w:tcPr>
             <w:tcW w:w="2200" w:type="dxa"/>
@@ -3828,12 +3765,6 @@
         </w:tc>
       </w:tr>
       <w:tr>
-        <w:tblPrEx>
-          <w:tblCellMar>
-            <w:top w:w="0" w:type="dxa"/>
-            <w:bottom w:w="0" w:type="dxa"/>
-          </w:tblCellMar>
-        </w:tblPrEx>
         <w:tc>
           <w:tcPr>
             <w:tcW w:w="2200" w:type="dxa"/>
@@ -3948,12 +3879,6 @@
         </w:tc>
       </w:tr>
       <w:tr>
-        <w:tblPrEx>
-          <w:tblCellMar>
-            <w:top w:w="0" w:type="dxa"/>
-            <w:bottom w:w="0" w:type="dxa"/>
-          </w:tblCellMar>
-        </w:tblPrEx>
         <w:tc>
           <w:tcPr>
             <w:tcW w:w="2200" w:type="dxa"/>

</xml_diff>